<commit_message>
Add dynamic HOD logic for technical subjects
</commit_message>
<xml_diff>
--- a/templates/default_template.docx
+++ b/templates/default_template.docx
@@ -1850,8 +1850,6 @@
               </w:rPr>
               <w:t xml:space="preserve"> }}</w:t>
             </w:r>
-            <w:bookmarkStart w:id="0" w:name="_GoBack"/>
-            <w:bookmarkEnd w:id="0"/>
           </w:p>
         </w:tc>
       </w:tr>
@@ -2026,6 +2024,8 @@
               <w:jc w:val="center"/>
               <w:rPr>
                 <w:rFonts w:cstheme="minorHAnsi"/>
+                <w:b/>
+                <w:bCs/>
                 <w:sz w:val="18"/>
                 <w:szCs w:val="18"/>
               </w:rPr>
@@ -2162,18 +2162,48 @@
               <w:jc w:val="center"/>
               <w:rPr>
                 <w:rFonts w:cstheme="minorHAnsi"/>
-                <w:sz w:val="18"/>
-                <w:szCs w:val="18"/>
-              </w:rPr>
-            </w:pPr>
-            <w:r>
-              <w:rPr>
-                <w:rFonts w:cstheme="minorHAnsi"/>
-                <w:sz w:val="18"/>
-                <w:szCs w:val="18"/>
-              </w:rPr>
-              <w:t>B. KOENZE</w:t>
-            </w:r>
+                <w:b/>
+                <w:bCs/>
+                <w:sz w:val="18"/>
+                <w:szCs w:val="18"/>
+              </w:rPr>
+            </w:pPr>
+            <w:proofErr w:type="gramStart"/>
+            <w:r>
+              <w:rPr>
+                <w:rFonts w:cstheme="minorHAnsi"/>
+                <w:b/>
+                <w:bCs/>
+                <w:sz w:val="18"/>
+                <w:szCs w:val="18"/>
+              </w:rPr>
+              <w:t xml:space="preserve">{{ </w:t>
+            </w:r>
+            <w:proofErr w:type="spellStart"/>
+            <w:r>
+              <w:rPr>
+                <w:rFonts w:cstheme="minorHAnsi"/>
+                <w:b/>
+                <w:bCs/>
+                <w:sz w:val="18"/>
+                <w:szCs w:val="18"/>
+              </w:rPr>
+              <w:t>hod</w:t>
+            </w:r>
+            <w:proofErr w:type="spellEnd"/>
+            <w:proofErr w:type="gramEnd"/>
+            <w:r>
+              <w:rPr>
+                <w:rFonts w:cstheme="minorHAnsi"/>
+                <w:b/>
+                <w:bCs/>
+                <w:sz w:val="18"/>
+                <w:szCs w:val="18"/>
+              </w:rPr>
+              <w:t xml:space="preserve"> }}</w:t>
+            </w:r>
+            <w:bookmarkStart w:id="0" w:name="_GoBack"/>
+            <w:bookmarkEnd w:id="0"/>
           </w:p>
         </w:tc>
         <w:tc>
@@ -2266,13 +2296,17 @@
               <w:jc w:val="center"/>
               <w:rPr>
                 <w:rFonts w:cstheme="minorHAnsi"/>
-                <w:sz w:val="18"/>
-                <w:szCs w:val="18"/>
-              </w:rPr>
-            </w:pPr>
-            <w:r>
-              <w:rPr>
-                <w:rFonts w:cstheme="minorHAnsi"/>
+                <w:b/>
+                <w:bCs/>
+                <w:sz w:val="18"/>
+                <w:szCs w:val="18"/>
+              </w:rPr>
+            </w:pPr>
+            <w:r>
+              <w:rPr>
+                <w:rFonts w:cstheme="minorHAnsi"/>
+                <w:b/>
+                <w:bCs/>
                 <w:sz w:val="18"/>
                 <w:szCs w:val="18"/>
               </w:rPr>

</xml_diff>